<commit_message>
Correcting a minor error in the Numbers MainD skip logic
</commit_message>
<xml_diff>
--- a/specs/Dynamic_Diagnostic_Engine_Spec_v10.docx
+++ b/specs/Dynamic_Diagnostic_Engine_Spec_v10.docx
@@ -2055,7 +2055,13 @@
               <w:t>skip_maind</w:t>
             </w:r>
             <w:r>
-              <w:t xml:space="preserve">), then the learner needs to take the MainD for both </w:t>
+              <w:t xml:space="preserve">), then the learner </w:t>
+            </w:r>
+            <w:r>
+              <w:t>should skip</w:t>
+            </w:r>
+            <w:r>
+              <w:t xml:space="preserve"> the MainD for both </w:t>
             </w:r>
             <w:r>
               <w:t>‘</w:t>
@@ -38219,7 +38225,13 @@
               <w:t>skip_maind</w:t>
             </w:r>
             <w:r>
-              <w:t xml:space="preserve">), then the learner needs to take the MainD for both </w:t>
+              <w:t xml:space="preserve">), then the learner </w:t>
+            </w:r>
+            <w:r>
+              <w:t>should skip</w:t>
+            </w:r>
+            <w:r>
+              <w:t xml:space="preserve"> the MainD for both </w:t>
             </w:r>
             <w:r>
               <w:t>‘</w:t>

</xml_diff>